<commit_message>
chore: rename Rentora to dwellm8
Wordmark only — the five sub-brands (Live, Own, Ops, Pro, Admin) are
unchanged. Package scope is now @dwellm8/*, bundle identifiers are
app.dwellm8.*, and the requirements PDF and DOCX are regenerated from the
renamed HTML source.
</commit_message>
<xml_diff>
--- a/docs/requirements/dwellm8-Requirements-v2.0.docx
+++ b/docs/requirements/dwellm8-Requirements-v2.0.docx
@@ -7,7 +7,7 @@
         <w:pStyle w:val="Title"/>
       </w:pPr>
       <w:r>
-        <w:t xml:space="preserve">Rentora — High-Level Product Requirements</w:t>
+        <w:t xml:space="preserve">dwellm8 — High-Level Product Requirements</w:t>
       </w:r>
     </w:p>
     <w:sdt>
@@ -110,7 +110,7 @@
         <w:t xml:space="preserve"> </w:t>
       </w:r>
       <w:r>
-        <w:t xml:space="preserve">  Rentora ·</w:t>
+        <w:t xml:space="preserve">  dwellm8 ·</w:t>
       </w:r>
       <w:r>
         <w:t xml:space="preserve"> </w:t>
@@ -119,7 +119,7 @@
         <w:rPr>
           <w:rStyle w:val="VerbatimChar"/>
         </w:rPr>
-        <w:t xml:space="preserve">tesserix/rentora</w:t>
+        <w:t xml:space="preserve">tesserix/dwellm8</w:t>
       </w:r>
     </w:p>
     <w:p>
@@ -547,7 +547,7 @@
         <w:pStyle w:val="FirstParagraph"/>
       </w:pPr>
       <w:r>
-        <w:t xml:space="preserve">Rentora is the system of record for a property in India — one property, one unit, one occupancy, one ledger, one document set — with a front door for each party who touches it: the owner, the property manager, the occupant, the service provider and the platform operator. It runs three verticals on one core, and it extends from renting a property to maintaining it and ultimately to selling it.</w:t>
+        <w:t xml:space="preserve">dwellm8 is the system of record for a property in India — one property, one unit, one occupancy, one ledger, one document set — with a front door for each party who touches it: the owner, the property manager, the occupant, the service provider and the platform operator. It runs three verticals on one core, and it extends from renting a property to maintaining it and ultimately to selling it.</w:t>
       </w:r>
     </w:p>
     <w:bookmarkStart w:id="10" w:name="the-problem"/>
@@ -995,7 +995,7 @@
         <w:t xml:space="preserve"> </w:t>
       </w:r>
       <w:r>
-        <w:t xml:space="preserve">Money settles owner-side through a regulated aggregator. Any design in which Rentora holds rent overnight in a platform account must be escalated, not implemented.</w:t>
+        <w:t xml:space="preserve">Money settles owner-side through a regulated aggregator. Any design in which dwellm8 holds rent overnight in a platform account must be escalated, not implemented.</w:t>
       </w:r>
       <w:r>
         <w:br/>
@@ -2778,7 +2778,7 @@
               <w:pStyle w:val="Compact"/>
             </w:pPr>
             <w:r>
-              <w:t xml:space="preserve">Rentora-side or partner agent handling lease origination and property sales</w:t>
+              <w:t xml:space="preserve">dwellm8-side or partner agent handling lease origination and property sales</w:t>
             </w:r>
           </w:p>
         </w:tc>
@@ -2850,7 +2850,7 @@
               <w:pStyle w:val="Compact"/>
             </w:pPr>
             <w:r>
-              <w:t xml:space="preserve">Public listing site (web, SEO) + Rentora Live app</w:t>
+              <w:t xml:space="preserve">Public listing site (web, SEO) + dwellm8 Live app</w:t>
             </w:r>
           </w:p>
         </w:tc>
@@ -2878,7 +2878,7 @@
               <w:pStyle w:val="Compact"/>
             </w:pPr>
             <w:r>
-              <w:t xml:space="preserve">Rentora's own operations, support, finance and compliance staff</w:t>
+              <w:t xml:space="preserve">dwellm8's own operations, support, finance and compliance staff</w:t>
             </w:r>
           </w:p>
         </w:tc>
@@ -3821,7 +3821,7 @@
         <w:pStyle w:val="BodyText"/>
       </w:pPr>
       <w:r>
-        <w:t xml:space="preserve">Rentora is</w:t>
+        <w:t xml:space="preserve">dwellm8 is</w:t>
       </w:r>
       <w:r>
         <w:t xml:space="preserve"> </w:t>
@@ -3834,7 +3834,7 @@
         <w:t xml:space="preserve">not an escrow and not a custodian of client funds</w:t>
       </w:r>
       <w:r>
-        <w:t xml:space="preserve">. Collections settle to the owner or the manager's regulated account through the payment aggregator. Where the platform advances a vendor payment before recovering it, that advance must be structured, capped, and reviewed against RBI payment-aggregator directions before it is built. A design in which rent accumulates in a Rentora-controlled account is escalated, never implemented.</w:t>
+        <w:t xml:space="preserve">. Collections settle to the owner or the manager's regulated account through the payment aggregator. Where the platform advances a vendor payment before recovering it, that advance must be structured, capped, and reviewed against RBI payment-aggregator directions before it is built. A design in which rent accumulates in a dwellm8-controlled account is escalated, never implemented.</w:t>
       </w:r>
     </w:p>
     <w:bookmarkEnd w:id="29"/>
@@ -4259,7 +4259,7 @@
         <w:pStyle w:val="FirstParagraph"/>
       </w:pPr>
       <w:r>
-        <w:t xml:space="preserve">Most maintenance disputes are not about the repair; they are about who pays. Rentora settles that</w:t>
+        <w:t xml:space="preserve">Most maintenance disputes are not about the repair; they are about who pays. dwellm8 settles that</w:t>
       </w:r>
       <w:r>
         <w:t xml:space="preserve"> </w:t>
@@ -4964,7 +4964,7 @@
         <w:pStyle w:val="FirstParagraph"/>
       </w:pPr>
       <w:r>
-        <w:t xml:space="preserve">Rentora does</w:t>
+        <w:t xml:space="preserve">dwellm8 does</w:t>
       </w:r>
       <w:r>
         <w:t xml:space="preserve"> </w:t>
@@ -5094,7 +5094,7 @@
         <w:t xml:space="preserve"> </w:t>
       </w:r>
       <w:r>
-        <w:t xml:space="preserve">Rentora earns when collections work. That is exactly what the platform is optimised to do, and it makes reliability a revenue problem rather than a support problem.</w:t>
+        <w:t xml:space="preserve">dwellm8 earns when collections work. That is exactly what the platform is optimised to do, and it makes reliability a revenue problem rather than a support problem.</w:t>
       </w:r>
     </w:p>
     <w:p>
@@ -5461,7 +5461,7 @@
               <w:pStyle w:val="Compact"/>
             </w:pPr>
             <w:r>
-              <w:t xml:space="preserve">The single charge point. The manager is the party Rentora does the operating work for, and this is where the owner statement already itemises deductions.</w:t>
+              <w:t xml:space="preserve">The single charge point. The manager is the party dwellm8 does the operating work for, and this is where the owner statement already itemises deductions.</w:t>
             </w:r>
           </w:p>
         </w:tc>
@@ -5930,7 +5930,7 @@
         <w:pStyle w:val="BodyText"/>
       </w:pPr>
       <w:r>
-        <w:t xml:space="preserve">India is not Australia — there is no statutory trust-account regime, managers are smaller, software willingness-to-pay is far lower, and Rentora bundles collections, maintenance, a vendor marketplace and compliance rather than selling a ledger. A transaction model may well be the right answer here where a subscription is not. But the gap is large enough that</w:t>
+        <w:t xml:space="preserve">India is not Australia — there is no statutory trust-account regime, managers are smaller, software willingness-to-pay is far lower, and dwellm8 bundles collections, maintenance, a vendor marketplace and compliance rather than selling a ledger. A transaction model may well be the right answer here where a subscription is not. But the gap is large enough that</w:t>
       </w:r>
       <w:r>
         <w:t xml:space="preserve"> </w:t>
@@ -6144,7 +6144,7 @@
               <w:pStyle w:val="Compact"/>
             </w:pPr>
             <w:r>
-              <w:t xml:space="preserve">Referral fee only; Rentora carries no risk and discloses the relationship</w:t>
+              <w:t xml:space="preserve">Referral fee only; dwellm8 carries no risk and discloses the relationship</w:t>
             </w:r>
           </w:p>
         </w:tc>
@@ -6980,7 +6980,7 @@
               <w:pStyle w:val="Compact"/>
             </w:pPr>
             <w:r>
-              <w:t xml:space="preserve">Rentora passes my organisation's security review</w:t>
+              <w:t xml:space="preserve">dwellm8 passes my organisation's security review</w:t>
             </w:r>
           </w:p>
         </w:tc>
@@ -19702,7 +19702,7 @@
         <w:t xml:space="preserve"> </w:t>
       </w:r>
       <w:r>
-        <w:t xml:space="preserve">RERA and advertising rules constrain what a listing may claim. A listing is generated from real inventory, so it cannot describe a unit that does not exist or is already occupied. Rentora does not take custody of transaction money; token and consideration flow between the parties through regulated rails. The document vault is the platform's structural advantage at sale time.</w:t>
+        <w:t xml:space="preserve">RERA and advertising rules constrain what a listing may claim. A listing is generated from real inventory, so it cannot describe a unit that does not exist or is already occupied. dwellm8 does not take custody of transaction money; token and consideration flow between the parties through regulated rails. The document vault is the platform's structural advantage at sale time.</w:t>
       </w:r>
     </w:p>
     <w:p>
@@ -21566,7 +21566,7 @@
               <w:pStyle w:val="Compact"/>
             </w:pPr>
             <w:r>
-              <w:t xml:space="preserve">to browse listings and understand what Rentora does without creating an account</w:t>
+              <w:t xml:space="preserve">to browse listings and understand what dwellm8 does without creating an account</w:t>
             </w:r>
           </w:p>
         </w:tc>
@@ -21733,7 +21733,7 @@
         <w:t xml:space="preserve"> </w:t>
       </w:r>
       <w:r>
-        <w:t xml:space="preserve">Let Rentora's own team operate the platform — onboard, configure, support, reconcile and intervene — without engineers running queries in production.</w:t>
+        <w:t xml:space="preserve">Let dwellm8's own team operate the platform — onboard, configure, support, reconcile and intervene — without engineers running queries in production.</w:t>
       </w:r>
     </w:p>
     <w:tbl>
@@ -26158,7 +26158,7 @@
         <w:pStyle w:val="FirstParagraph"/>
       </w:pPr>
       <w:r>
-        <w:t xml:space="preserve">Rentora is used standing in a corridor, at a gate, on a scooter and on a ₹9,000 Android phone with two bars of signal. Mobile is not a companion to the web product; for tenants, residents, guardians, technicians and field agents it is the</w:t>
+        <w:t xml:space="preserve">dwellm8 is used standing in a corridor, at a gate, on a scooter and on a ₹9,000 Android phone with two bars of signal. Mobile is not a companion to the web product; for tenants, residents, guardians, technicians and field agents it is the</w:t>
       </w:r>
       <w:r>
         <w:t xml:space="preserve"> </w:t>
@@ -26247,7 +26247,7 @@
                 <w:b/>
                 <w:bCs/>
               </w:rPr>
-              <w:t xml:space="preserve">Rentora Live</w:t>
+              <w:t xml:space="preserve">dwellm8 Live</w:t>
             </w:r>
           </w:p>
         </w:tc>
@@ -26286,7 +26286,7 @@
                 <w:b/>
                 <w:bCs/>
               </w:rPr>
-              <w:t xml:space="preserve">Rentora Own</w:t>
+              <w:t xml:space="preserve">dwellm8 Own</w:t>
             </w:r>
           </w:p>
         </w:tc>
@@ -26325,7 +26325,7 @@
                 <w:b/>
                 <w:bCs/>
               </w:rPr>
-              <w:t xml:space="preserve">Rentora Ops</w:t>
+              <w:t xml:space="preserve">dwellm8 Ops</w:t>
             </w:r>
           </w:p>
         </w:tc>
@@ -26364,7 +26364,7 @@
                 <w:b/>
                 <w:bCs/>
               </w:rPr>
-              <w:t xml:space="preserve">Rentora Pro</w:t>
+              <w:t xml:space="preserve">dwellm8 Pro</w:t>
             </w:r>
           </w:p>
         </w:tc>
@@ -26403,7 +26403,7 @@
                 <w:b/>
                 <w:bCs/>
               </w:rPr>
-              <w:t xml:space="preserve">Rentora Admin</w:t>
+              <w:t xml:space="preserve">dwellm8 Admin</w:t>
             </w:r>
           </w:p>
         </w:tc>
@@ -26760,7 +26760,7 @@
         <w:t xml:space="preserve"> </w:t>
       </w:r>
       <w:r>
-        <w:t xml:space="preserve">A manager runs listings, collections, dispatch and accounting from a desk, and inspections, cash collection and site visits from a phone. Rentora Ops is therefore delivered as a</w:t>
+        <w:t xml:space="preserve">A manager runs listings, collections, dispatch and accounting from a desk, and inspections, cash collection and site visits from a phone. dwellm8 Ops is therefore delivered as a</w:t>
       </w:r>
       <w:r>
         <w:t xml:space="preserve"> </w:t>
@@ -27284,7 +27284,7 @@
                 <w:b/>
                 <w:bCs/>
               </w:rPr>
-              <w:t xml:space="preserve">Rentora Admin Console</w:t>
+              <w:t xml:space="preserve">dwellm8 Admin Console</w:t>
             </w:r>
             <w:r>
               <w:br/>
@@ -27356,7 +27356,7 @@
                 <w:b/>
                 <w:bCs/>
               </w:rPr>
-              <w:t xml:space="preserve">Rentora Ops Web</w:t>
+              <w:t xml:space="preserve">dwellm8 Ops Web</w:t>
             </w:r>
             <w:r>
               <w:br/>
@@ -28637,7 +28637,7 @@
               <w:pStyle w:val="Compact"/>
             </w:pPr>
             <w:r>
-              <w:t xml:space="preserve">Referral integrations with disclosure; Rentora carries no risk</w:t>
+              <w:t xml:space="preserve">Referral integrations with disclosure; dwellm8 carries no risk</w:t>
             </w:r>
           </w:p>
         </w:tc>
@@ -28923,7 +28923,7 @@
           <w:b/>
           <w:bCs/>
         </w:rPr>
-        <w:t xml:space="preserve">Rentora is a modular monolith, not a set of microservices.</w:t>
+        <w:t xml:space="preserve">dwellm8 is a modular monolith, not a set of microservices.</w:t>
       </w:r>
       <w:r>
         <w:t xml:space="preserve"> </w:t>
@@ -29586,7 +29586,7 @@
         <w:pStyle w:val="BodyText"/>
       </w:pPr>
       <w:r>
-        <w:t xml:space="preserve">The separation matters because Rentora's permission model is inherently relational, not hierarchical. "This manager may approve spend on this unit because the owner granted a mandate scoped to it, which is still in force" is a relationship question, and expressing it as a role string in a token is how permission models rot.</w:t>
+        <w:t xml:space="preserve">The separation matters because dwellm8's permission model is inherently relational, not hierarchical. "This manager may approve spend on this unit because the owner granted a mandate scoped to it, which is still in force" is a relationship question, and expressing it as a role string in a token is how permission models rot.</w:t>
       </w:r>
     </w:p>
     <w:bookmarkStart w:id="89" w:name="what-this-gives-us"/>
@@ -30032,7 +30032,7 @@
               <w:pStyle w:val="Compact"/>
             </w:pPr>
             <w:r>
-              <w:t xml:space="preserve">Browse and search published listings; open a listing with photos, amenities and the full cost breakdown; see approximate location; view the public product pages that explain how Rentora works;</w:t>
+              <w:t xml:space="preserve">Browse and search published listings; open a listing with photos, amenities and the full cost breakdown; see approximate location; view the public product pages that explain how dwellm8 works;</w:t>
             </w:r>
             <w:r>
               <w:t xml:space="preserve"> </w:t>
@@ -30234,7 +30234,7 @@
               <w:pStyle w:val="Compact"/>
             </w:pPr>
             <w:r>
-              <w:t xml:space="preserve">Rentora platform staff</w:t>
+              <w:t xml:space="preserve">dwellm8 platform staff</w:t>
             </w:r>
           </w:p>
         </w:tc>
@@ -32428,7 +32428,7 @@
               <w:pStyle w:val="Compact"/>
             </w:pPr>
             <w:r>
-              <w:t xml:space="preserve">RBI payment-aggregator directions bind how funds may be held and routed. Rentora holds no client funds; any vendor advance model is reviewed before build.</w:t>
+              <w:t xml:space="preserve">RBI payment-aggregator directions bind how funds may be held and routed. dwellm8 holds no client funds; any vendor advance model is reviewed before build.</w:t>
             </w:r>
           </w:p>
         </w:tc>
@@ -32484,7 +32484,7 @@
               <w:pStyle w:val="Compact"/>
             </w:pPr>
             <w:r>
-              <w:t xml:space="preserve">Aadhaar-based eSign through a licensed provider produces a signed artefact and completion certificate. The Aadhaar number passes through the provider flow and is never retained by Rentora. A non-Aadhaar path must exist, with its weaker evidentiary weight recorded.</w:t>
+              <w:t xml:space="preserve">Aadhaar-based eSign through a licensed provider produces a signed artefact and completion certificate. The Aadhaar number passes through the provider flow and is never retained by dwellm8. A non-Aadhaar path must exist, with its weaker evidentiary weight recorded.</w:t>
             </w:r>
           </w:p>
         </w:tc>
@@ -32693,7 +32693,7 @@
               <w:pStyle w:val="Compact"/>
             </w:pPr>
             <w:r>
-              <w:t xml:space="preserve">Binds listings, agent conduct and advertising claims. Where Rentora or its agents originate leases or sales, agent registration and claim substantiation apply.</w:t>
+              <w:t xml:space="preserve">Binds listings, agent conduct and advertising claims. Where dwellm8 or its agents originate leases or sales, agent registration and claim substantiation apply.</w:t>
             </w:r>
           </w:p>
         </w:tc>
@@ -33543,7 +33543,7 @@
         </w:numPr>
       </w:pPr>
       <w:r>
-        <w:t xml:space="preserve">Rentora never holds client funds. Every design here assumes settlement through a regulated aggregator.</w:t>
+        <w:t xml:space="preserve">dwellm8 never holds client funds. Every design here assumes settlement through a regulated aggregator.</w:t>
       </w:r>
     </w:p>
     <w:p>
@@ -33567,7 +33567,7 @@
         </w:numPr>
       </w:pPr>
       <w:r>
-        <w:t xml:space="preserve">Sales is an extension of an operating relationship, not a standalone portal business. Rentora will not win a listings-portal fight and does not attempt one.</w:t>
+        <w:t xml:space="preserve">Sales is an extension of an operating relationship, not a standalone portal business. dwellm8 will not win a listings-portal fight and does not attempt one.</w:t>
       </w:r>
     </w:p>
     <w:p>
@@ -34219,7 +34219,7 @@
               <w:pStyle w:val="Compact"/>
             </w:pPr>
             <w:r>
-              <w:t xml:space="preserve">Whether Rentora acts as an agent or only as a facilitator determines registration obligations</w:t>
+              <w:t xml:space="preserve">Whether dwellm8 acts as an agent or only as a facilitator determines registration obligations</w:t>
             </w:r>
           </w:p>
         </w:tc>
@@ -34609,7 +34609,7 @@
         <w:pStyle w:val="FirstParagraph"/>
       </w:pPr>
       <w:r>
-        <w:t xml:space="preserve">Rentora was compared against PropertyMe, Australia's largest property-management platform and the most mature example of the manager-in-the-middle model, in July 2026. The purpose was to find capability gaps, not to copy a pricing or regulatory model that does not apply in India.</w:t>
+        <w:t xml:space="preserve">dwellm8 was compared against PropertyMe, Australia's largest property-management platform and the most mature example of the manager-in-the-middle model, in July 2026. The purpose was to find capability gaps, not to copy a pricing or regulatory model that does not apply in India.</w:t>
       </w:r>
     </w:p>
     <w:bookmarkStart w:id="106" w:name="what-their-model-tells-us"/>
@@ -34665,7 +34665,7 @@
               <w:pStyle w:val="Compact"/>
             </w:pPr>
             <w:r>
-              <w:t xml:space="preserve">Rentora (India)</w:t>
+              <w:t xml:space="preserve">dwellm8 (India)</w:t>
             </w:r>
           </w:p>
         </w:tc>
@@ -34761,7 +34761,7 @@
               <w:pStyle w:val="Compact"/>
             </w:pPr>
             <w:r>
-              <w:t xml:space="preserve">Australian management is performed by licensed agencies operating statutory trust accounts; the software is a regulated ledger sold as infrastructure, and the percentage economics sit with the agency. India has no equivalent regime, managers are far smaller, subscription willingness-to-pay is low, and Rentora bundles collections, maintenance, a vendor marketplace, documents and compliance rather than selling a ledger. A transaction model can be right here where a subscription is not — provided rate, base and cap remain rule-table values.</w:t>
+              <w:t xml:space="preserve">Australian management is performed by licensed agencies operating statutory trust accounts; the software is a regulated ledger sold as infrastructure, and the percentage economics sit with the agency. India has no equivalent regime, managers are far smaller, subscription willingness-to-pay is low, and dwellm8 bundles collections, maintenance, a vendor marketplace, documents and compliance rather than selling a ledger. A transaction model can be right here where a subscription is not — provided rate, base and cap remain rule-table values.</w:t>
             </w:r>
           </w:p>
         </w:tc>
@@ -35734,13 +35734,13 @@
       </w:tr>
     </w:tbl>
     <w:bookmarkEnd w:id="107"/>
-    <w:bookmarkStart w:id="108" w:name="where-rentora-goes-further"/>
+    <w:bookmarkStart w:id="108" w:name="where-dwellm8-goes-further"/>
     <w:p>
       <w:pPr>
         <w:pStyle w:val="Heading3"/>
       </w:pPr>
       <w:r>
-        <w:t xml:space="preserve">14.3 Where Rentora goes further</w:t>
+        <w:t xml:space="preserve">14.3 Where dwellm8 goes further</w:t>
       </w:r>
     </w:p>
     <w:p>
@@ -35888,7 +35888,7 @@
         <w:pStyle w:val="BodyText"/>
       </w:pPr>
       <w:r>
-        <w:t xml:space="preserve">Version 2.0 sets the fee at 2.99%, fixes the backend as one modular monolith API serving every client, adds 25 capabilities found by benchmarking against PropertyMe, and adds module M20 workflow automation. Version 1.9 charged the platform fee once, deducted by the manager at payout, with instrument costs passed through separately. Version 1.7 settled the fee bearer, specifies the authorisation model and makes Rentora Ops a full web console as well as an app. Version 1.6 added module M19 — a no-sign-up sandbox anyone can use before creating an account, and a training and release-preview sandbox for existing customers and their staff. Version 1.5 defined the five access tiers, the no-anonymous rule for administrative surfaces, and the demonstration-data workspace. Version 1.4 settled identity and authorisation — Google Identity Platform for every user, OpenFGA plus RBAC for permissions. Version 1.3 added public discovery, listings and inspection scheduling, and settles the technology stack. Version 1.2 made the Admin surface web and mobile together. Version 1.1 replaced the subscription model with a flat 2.99% transaction fee and adds the premium AI tier, the Admin web console, the end-to-end workflows and the integration framework. This document defines</w:t>
+        <w:t xml:space="preserve">Version 2.0 sets the fee at 2.99%, fixes the backend as one modular monolith API serving every client, adds 25 capabilities found by benchmarking against PropertyMe, and adds module M20 workflow automation. Version 1.9 charged the platform fee once, deducted by the manager at payout, with instrument costs passed through separately. Version 1.7 settled the fee bearer, specifies the authorisation model and makes dwellm8 Ops a full web console as well as an app. Version 1.6 added module M19 — a no-sign-up sandbox anyone can use before creating an account, and a training and release-preview sandbox for existing customers and their staff. Version 1.5 defined the five access tiers, the no-anonymous rule for administrative surfaces, and the demonstration-data workspace. Version 1.4 settled identity and authorisation — Google Identity Platform for every user, OpenFGA plus RBAC for permissions. Version 1.3 added public discovery, listings and inspection scheduling, and settles the technology stack. Version 1.2 made the Admin surface web and mobile together. Version 1.1 replaced the subscription model with a flat 2.99% transaction fee and adds the premium AI tier, the Admin web console, the end-to-end workflows and the integration framework. This document defines</w:t>
       </w:r>
       <w:r>
         <w:t xml:space="preserve"> </w:t>

</xml_diff>

<commit_message>
docs: record dwellm8.com as the production domain, refresh requirement documents
</commit_message>
<xml_diff>
--- a/docs/requirements/dwellm8-Requirements-v2.0.docx
+++ b/docs/requirements/dwellm8-Requirements-v2.0.docx
@@ -7,7 +7,7 @@
         <w:pStyle w:val="Title"/>
       </w:pPr>
       <w:r>
-        <w:t xml:space="preserve">dwellm8 — High-Level Product Requirements</w:t>
+        <w:t xml:space="preserve">Dwellm8 — High-Level Product Requirements</w:t>
       </w:r>
     </w:p>
     <w:sdt>
@@ -110,7 +110,7 @@
         <w:t xml:space="preserve"> </w:t>
       </w:r>
       <w:r>
-        <w:t xml:space="preserve">  dwellm8 ·</w:t>
+        <w:t xml:space="preserve">  Dwellm8 ·</w:t>
       </w:r>
       <w:r>
         <w:t xml:space="preserve"> </w:t>
@@ -547,7 +547,7 @@
         <w:pStyle w:val="FirstParagraph"/>
       </w:pPr>
       <w:r>
-        <w:t xml:space="preserve">dwellm8 is the system of record for a property in India — one property, one unit, one occupancy, one ledger, one document set — with a front door for each party who touches it: the owner, the property manager, the occupant, the service provider and the platform operator. It runs three verticals on one core, and it extends from renting a property to maintaining it and ultimately to selling it.</w:t>
+        <w:t xml:space="preserve">Dwellm8 is the system of record for a property in India — one property, one unit, one occupancy, one ledger, one document set — with a front door for each party who touches it: the owner, the property manager, the occupant, the service provider and the platform operator. It runs three verticals on one core, and it extends from renting a property to maintaining it and ultimately to selling it.</w:t>
       </w:r>
     </w:p>
     <w:bookmarkStart w:id="10" w:name="the-problem"/>
@@ -995,7 +995,7 @@
         <w:t xml:space="preserve"> </w:t>
       </w:r>
       <w:r>
-        <w:t xml:space="preserve">Money settles owner-side through a regulated aggregator. Any design in which dwellm8 holds rent overnight in a platform account must be escalated, not implemented.</w:t>
+        <w:t xml:space="preserve">Money settles owner-side through a regulated aggregator. Any design in which Dwellm8 holds rent overnight in a platform account must be escalated, not implemented.</w:t>
       </w:r>
       <w:r>
         <w:br/>
@@ -2850,7 +2850,7 @@
               <w:pStyle w:val="Compact"/>
             </w:pPr>
             <w:r>
-              <w:t xml:space="preserve">Public listing site (web, SEO) + dwellm8 Live app</w:t>
+              <w:t xml:space="preserve">Public listing site (web, SEO) + Dwellm8 Live app</w:t>
             </w:r>
           </w:p>
         </w:tc>
@@ -2878,7 +2878,7 @@
               <w:pStyle w:val="Compact"/>
             </w:pPr>
             <w:r>
-              <w:t xml:space="preserve">dwellm8's own operations, support, finance and compliance staff</w:t>
+              <w:t xml:space="preserve">Dwellm8's own operations, support, finance and compliance staff</w:t>
             </w:r>
           </w:p>
         </w:tc>
@@ -3821,7 +3821,7 @@
         <w:pStyle w:val="BodyText"/>
       </w:pPr>
       <w:r>
-        <w:t xml:space="preserve">dwellm8 is</w:t>
+        <w:t xml:space="preserve">Dwellm8 is</w:t>
       </w:r>
       <w:r>
         <w:t xml:space="preserve"> </w:t>
@@ -4259,7 +4259,7 @@
         <w:pStyle w:val="FirstParagraph"/>
       </w:pPr>
       <w:r>
-        <w:t xml:space="preserve">Most maintenance disputes are not about the repair; they are about who pays. dwellm8 settles that</w:t>
+        <w:t xml:space="preserve">Most maintenance disputes are not about the repair; they are about who pays. Dwellm8 settles that</w:t>
       </w:r>
       <w:r>
         <w:t xml:space="preserve"> </w:t>
@@ -4964,7 +4964,7 @@
         <w:pStyle w:val="FirstParagraph"/>
       </w:pPr>
       <w:r>
-        <w:t xml:space="preserve">dwellm8 does</w:t>
+        <w:t xml:space="preserve">Dwellm8 does</w:t>
       </w:r>
       <w:r>
         <w:t xml:space="preserve"> </w:t>
@@ -5094,7 +5094,7 @@
         <w:t xml:space="preserve"> </w:t>
       </w:r>
       <w:r>
-        <w:t xml:space="preserve">dwellm8 earns when collections work. That is exactly what the platform is optimised to do, and it makes reliability a revenue problem rather than a support problem.</w:t>
+        <w:t xml:space="preserve">Dwellm8 earns when collections work. That is exactly what the platform is optimised to do, and it makes reliability a revenue problem rather than a support problem.</w:t>
       </w:r>
     </w:p>
     <w:p>
@@ -5461,7 +5461,7 @@
               <w:pStyle w:val="Compact"/>
             </w:pPr>
             <w:r>
-              <w:t xml:space="preserve">The single charge point. The manager is the party dwellm8 does the operating work for, and this is where the owner statement already itemises deductions.</w:t>
+              <w:t xml:space="preserve">The single charge point. The manager is the party Dwellm8 does the operating work for, and this is where the owner statement already itemises deductions.</w:t>
             </w:r>
           </w:p>
         </w:tc>
@@ -5930,7 +5930,7 @@
         <w:pStyle w:val="BodyText"/>
       </w:pPr>
       <w:r>
-        <w:t xml:space="preserve">India is not Australia — there is no statutory trust-account regime, managers are smaller, software willingness-to-pay is far lower, and dwellm8 bundles collections, maintenance, a vendor marketplace and compliance rather than selling a ledger. A transaction model may well be the right answer here where a subscription is not. But the gap is large enough that</w:t>
+        <w:t xml:space="preserve">India is not Australia — there is no statutory trust-account regime, managers are smaller, software willingness-to-pay is far lower, and Dwellm8 bundles collections, maintenance, a vendor marketplace and compliance rather than selling a ledger. A transaction model may well be the right answer here where a subscription is not. But the gap is large enough that</w:t>
       </w:r>
       <w:r>
         <w:t xml:space="preserve"> </w:t>
@@ -6144,7 +6144,7 @@
               <w:pStyle w:val="Compact"/>
             </w:pPr>
             <w:r>
-              <w:t xml:space="preserve">Referral fee only; dwellm8 carries no risk and discloses the relationship</w:t>
+              <w:t xml:space="preserve">Referral fee only; Dwellm8 carries no risk and discloses the relationship</w:t>
             </w:r>
           </w:p>
         </w:tc>
@@ -6980,7 +6980,7 @@
               <w:pStyle w:val="Compact"/>
             </w:pPr>
             <w:r>
-              <w:t xml:space="preserve">dwellm8 passes my organisation's security review</w:t>
+              <w:t xml:space="preserve">Dwellm8 passes my organisation's security review</w:t>
             </w:r>
           </w:p>
         </w:tc>
@@ -19702,7 +19702,7 @@
         <w:t xml:space="preserve"> </w:t>
       </w:r>
       <w:r>
-        <w:t xml:space="preserve">RERA and advertising rules constrain what a listing may claim. A listing is generated from real inventory, so it cannot describe a unit that does not exist or is already occupied. dwellm8 does not take custody of transaction money; token and consideration flow between the parties through regulated rails. The document vault is the platform's structural advantage at sale time.</w:t>
+        <w:t xml:space="preserve">RERA and advertising rules constrain what a listing may claim. A listing is generated from real inventory, so it cannot describe a unit that does not exist or is already occupied. Dwellm8 does not take custody of transaction money; token and consideration flow between the parties through regulated rails. The document vault is the platform's structural advantage at sale time.</w:t>
       </w:r>
     </w:p>
     <w:p>
@@ -21566,7 +21566,7 @@
               <w:pStyle w:val="Compact"/>
             </w:pPr>
             <w:r>
-              <w:t xml:space="preserve">to browse listings and understand what dwellm8 does without creating an account</w:t>
+              <w:t xml:space="preserve">to browse listings and understand what Dwellm8 does without creating an account</w:t>
             </w:r>
           </w:p>
         </w:tc>
@@ -21733,7 +21733,7 @@
         <w:t xml:space="preserve"> </w:t>
       </w:r>
       <w:r>
-        <w:t xml:space="preserve">Let dwellm8's own team operate the platform — onboard, configure, support, reconcile and intervene — without engineers running queries in production.</w:t>
+        <w:t xml:space="preserve">Let Dwellm8's own team operate the platform — onboard, configure, support, reconcile and intervene — without engineers running queries in production.</w:t>
       </w:r>
     </w:p>
     <w:tbl>
@@ -26158,7 +26158,7 @@
         <w:pStyle w:val="FirstParagraph"/>
       </w:pPr>
       <w:r>
-        <w:t xml:space="preserve">dwellm8 is used standing in a corridor, at a gate, on a scooter and on a ₹9,000 Android phone with two bars of signal. Mobile is not a companion to the web product; for tenants, residents, guardians, technicians and field agents it is the</w:t>
+        <w:t xml:space="preserve">Dwellm8 is used standing in a corridor, at a gate, on a scooter and on a ₹9,000 Android phone with two bars of signal. Mobile is not a companion to the web product; for tenants, residents, guardians, technicians and field agents it is the</w:t>
       </w:r>
       <w:r>
         <w:t xml:space="preserve"> </w:t>
@@ -26247,7 +26247,7 @@
                 <w:b/>
                 <w:bCs/>
               </w:rPr>
-              <w:t xml:space="preserve">dwellm8 Live</w:t>
+              <w:t xml:space="preserve">Dwellm8 Live</w:t>
             </w:r>
           </w:p>
         </w:tc>
@@ -26286,7 +26286,7 @@
                 <w:b/>
                 <w:bCs/>
               </w:rPr>
-              <w:t xml:space="preserve">dwellm8 Own</w:t>
+              <w:t xml:space="preserve">Dwellm8 Own</w:t>
             </w:r>
           </w:p>
         </w:tc>
@@ -26325,7 +26325,7 @@
                 <w:b/>
                 <w:bCs/>
               </w:rPr>
-              <w:t xml:space="preserve">dwellm8 Ops</w:t>
+              <w:t xml:space="preserve">Dwellm8 Ops</w:t>
             </w:r>
           </w:p>
         </w:tc>
@@ -26364,7 +26364,7 @@
                 <w:b/>
                 <w:bCs/>
               </w:rPr>
-              <w:t xml:space="preserve">dwellm8 Pro</w:t>
+              <w:t xml:space="preserve">Dwellm8 Pro</w:t>
             </w:r>
           </w:p>
         </w:tc>
@@ -26403,7 +26403,7 @@
                 <w:b/>
                 <w:bCs/>
               </w:rPr>
-              <w:t xml:space="preserve">dwellm8 Admin</w:t>
+              <w:t xml:space="preserve">Dwellm8 Admin</w:t>
             </w:r>
           </w:p>
         </w:tc>
@@ -26760,7 +26760,7 @@
         <w:t xml:space="preserve"> </w:t>
       </w:r>
       <w:r>
-        <w:t xml:space="preserve">A manager runs listings, collections, dispatch and accounting from a desk, and inspections, cash collection and site visits from a phone. dwellm8 Ops is therefore delivered as a</w:t>
+        <w:t xml:space="preserve">A manager runs listings, collections, dispatch and accounting from a desk, and inspections, cash collection and site visits from a phone. Dwellm8 Ops is therefore delivered as a</w:t>
       </w:r>
       <w:r>
         <w:t xml:space="preserve"> </w:t>
@@ -27284,7 +27284,7 @@
                 <w:b/>
                 <w:bCs/>
               </w:rPr>
-              <w:t xml:space="preserve">dwellm8 Admin Console</w:t>
+              <w:t xml:space="preserve">Dwellm8 Admin Console</w:t>
             </w:r>
             <w:r>
               <w:br/>
@@ -27356,7 +27356,7 @@
                 <w:b/>
                 <w:bCs/>
               </w:rPr>
-              <w:t xml:space="preserve">dwellm8 Ops Web</w:t>
+              <w:t xml:space="preserve">Dwellm8 Ops Web</w:t>
             </w:r>
             <w:r>
               <w:br/>
@@ -28637,7 +28637,7 @@
               <w:pStyle w:val="Compact"/>
             </w:pPr>
             <w:r>
-              <w:t xml:space="preserve">Referral integrations with disclosure; dwellm8 carries no risk</w:t>
+              <w:t xml:space="preserve">Referral integrations with disclosure; Dwellm8 carries no risk</w:t>
             </w:r>
           </w:p>
         </w:tc>
@@ -28923,7 +28923,7 @@
           <w:b/>
           <w:bCs/>
         </w:rPr>
-        <w:t xml:space="preserve">dwellm8 is a modular monolith, not a set of microservices.</w:t>
+        <w:t xml:space="preserve">Dwellm8 is a modular monolith, not a set of microservices.</w:t>
       </w:r>
       <w:r>
         <w:t xml:space="preserve"> </w:t>
@@ -29586,7 +29586,7 @@
         <w:pStyle w:val="BodyText"/>
       </w:pPr>
       <w:r>
-        <w:t xml:space="preserve">The separation matters because dwellm8's permission model is inherently relational, not hierarchical. "This manager may approve spend on this unit because the owner granted a mandate scoped to it, which is still in force" is a relationship question, and expressing it as a role string in a token is how permission models rot.</w:t>
+        <w:t xml:space="preserve">The separation matters because Dwellm8's permission model is inherently relational, not hierarchical. "This manager may approve spend on this unit because the owner granted a mandate scoped to it, which is still in force" is a relationship question, and expressing it as a role string in a token is how permission models rot.</w:t>
       </w:r>
     </w:p>
     <w:bookmarkStart w:id="89" w:name="what-this-gives-us"/>
@@ -30032,7 +30032,7 @@
               <w:pStyle w:val="Compact"/>
             </w:pPr>
             <w:r>
-              <w:t xml:space="preserve">Browse and search published listings; open a listing with photos, amenities and the full cost breakdown; see approximate location; view the public product pages that explain how dwellm8 works;</w:t>
+              <w:t xml:space="preserve">Browse and search published listings; open a listing with photos, amenities and the full cost breakdown; see approximate location; view the public product pages that explain how Dwellm8 works;</w:t>
             </w:r>
             <w:r>
               <w:t xml:space="preserve"> </w:t>
@@ -30234,7 +30234,7 @@
               <w:pStyle w:val="Compact"/>
             </w:pPr>
             <w:r>
-              <w:t xml:space="preserve">dwellm8 platform staff</w:t>
+              <w:t xml:space="preserve">Dwellm8 platform staff</w:t>
             </w:r>
           </w:p>
         </w:tc>
@@ -32428,7 +32428,7 @@
               <w:pStyle w:val="Compact"/>
             </w:pPr>
             <w:r>
-              <w:t xml:space="preserve">RBI payment-aggregator directions bind how funds may be held and routed. dwellm8 holds no client funds; any vendor advance model is reviewed before build.</w:t>
+              <w:t xml:space="preserve">RBI payment-aggregator directions bind how funds may be held and routed. Dwellm8 holds no client funds; any vendor advance model is reviewed before build.</w:t>
             </w:r>
           </w:p>
         </w:tc>
@@ -32693,7 +32693,7 @@
               <w:pStyle w:val="Compact"/>
             </w:pPr>
             <w:r>
-              <w:t xml:space="preserve">Binds listings, agent conduct and advertising claims. Where dwellm8 or its agents originate leases or sales, agent registration and claim substantiation apply.</w:t>
+              <w:t xml:space="preserve">Binds listings, agent conduct and advertising claims. Where Dwellm8 or its agents originate leases or sales, agent registration and claim substantiation apply.</w:t>
             </w:r>
           </w:p>
         </w:tc>
@@ -33543,7 +33543,7 @@
         </w:numPr>
       </w:pPr>
       <w:r>
-        <w:t xml:space="preserve">dwellm8 never holds client funds. Every design here assumes settlement through a regulated aggregator.</w:t>
+        <w:t xml:space="preserve">Dwellm8 never holds client funds. Every design here assumes settlement through a regulated aggregator.</w:t>
       </w:r>
     </w:p>
     <w:p>
@@ -33567,7 +33567,7 @@
         </w:numPr>
       </w:pPr>
       <w:r>
-        <w:t xml:space="preserve">Sales is an extension of an operating relationship, not a standalone portal business. dwellm8 will not win a listings-portal fight and does not attempt one.</w:t>
+        <w:t xml:space="preserve">Sales is an extension of an operating relationship, not a standalone portal business. Dwellm8 will not win a listings-portal fight and does not attempt one.</w:t>
       </w:r>
     </w:p>
     <w:p>
@@ -34219,7 +34219,7 @@
               <w:pStyle w:val="Compact"/>
             </w:pPr>
             <w:r>
-              <w:t xml:space="preserve">Whether dwellm8 acts as an agent or only as a facilitator determines registration obligations</w:t>
+              <w:t xml:space="preserve">Whether Dwellm8 acts as an agent or only as a facilitator determines registration obligations</w:t>
             </w:r>
           </w:p>
         </w:tc>
@@ -34609,7 +34609,7 @@
         <w:pStyle w:val="FirstParagraph"/>
       </w:pPr>
       <w:r>
-        <w:t xml:space="preserve">dwellm8 was compared against PropertyMe, Australia's largest property-management platform and the most mature example of the manager-in-the-middle model, in July 2026. The purpose was to find capability gaps, not to copy a pricing or regulatory model that does not apply in India.</w:t>
+        <w:t xml:space="preserve">Dwellm8 was compared against PropertyMe, Australia's largest property-management platform and the most mature example of the manager-in-the-middle model, in July 2026. The purpose was to find capability gaps, not to copy a pricing or regulatory model that does not apply in India.</w:t>
       </w:r>
     </w:p>
     <w:bookmarkStart w:id="106" w:name="what-their-model-tells-us"/>
@@ -34665,7 +34665,7 @@
               <w:pStyle w:val="Compact"/>
             </w:pPr>
             <w:r>
-              <w:t xml:space="preserve">dwellm8 (India)</w:t>
+              <w:t xml:space="preserve">Dwellm8 (India)</w:t>
             </w:r>
           </w:p>
         </w:tc>
@@ -34761,7 +34761,7 @@
               <w:pStyle w:val="Compact"/>
             </w:pPr>
             <w:r>
-              <w:t xml:space="preserve">Australian management is performed by licensed agencies operating statutory trust accounts; the software is a regulated ledger sold as infrastructure, and the percentage economics sit with the agency. India has no equivalent regime, managers are far smaller, subscription willingness-to-pay is low, and dwellm8 bundles collections, maintenance, a vendor marketplace, documents and compliance rather than selling a ledger. A transaction model can be right here where a subscription is not — provided rate, base and cap remain rule-table values.</w:t>
+              <w:t xml:space="preserve">Australian management is performed by licensed agencies operating statutory trust accounts; the software is a regulated ledger sold as infrastructure, and the percentage economics sit with the agency. India has no equivalent regime, managers are far smaller, subscription willingness-to-pay is low, and Dwellm8 bundles collections, maintenance, a vendor marketplace, documents and compliance rather than selling a ledger. A transaction model can be right here where a subscription is not — provided rate, base and cap remain rule-table values.</w:t>
             </w:r>
           </w:p>
         </w:tc>
@@ -35740,7 +35740,7 @@
         <w:pStyle w:val="Heading3"/>
       </w:pPr>
       <w:r>
-        <w:t xml:space="preserve">14.3 Where dwellm8 goes further</w:t>
+        <w:t xml:space="preserve">14.3 Where Dwellm8 goes further</w:t>
       </w:r>
     </w:p>
     <w:p>
@@ -35888,7 +35888,7 @@
         <w:pStyle w:val="BodyText"/>
       </w:pPr>
       <w:r>
-        <w:t xml:space="preserve">Version 2.0 sets the fee at 2.99%, fixes the backend as one modular monolith API serving every client, adds 25 capabilities found by benchmarking against PropertyMe, and adds module M20 workflow automation. Version 1.9 charged the platform fee once, deducted by the manager at payout, with instrument costs passed through separately. Version 1.7 settled the fee bearer, specifies the authorisation model and makes dwellm8 Ops a full web console as well as an app. Version 1.6 added module M19 — a no-sign-up sandbox anyone can use before creating an account, and a training and release-preview sandbox for existing customers and their staff. Version 1.5 defined the five access tiers, the no-anonymous rule for administrative surfaces, and the demonstration-data workspace. Version 1.4 settled identity and authorisation — Google Identity Platform for every user, OpenFGA plus RBAC for permissions. Version 1.3 added public discovery, listings and inspection scheduling, and settles the technology stack. Version 1.2 made the Admin surface web and mobile together. Version 1.1 replaced the subscription model with a flat 2.99% transaction fee and adds the premium AI tier, the Admin web console, the end-to-end workflows and the integration framework. This document defines</w:t>
+        <w:t xml:space="preserve">Version 2.0 sets the fee at 2.99%, fixes the backend as one modular monolith API serving every client, adds 25 capabilities found by benchmarking against PropertyMe, and adds module M20 workflow automation. Version 1.9 charged the platform fee once, deducted by the manager at payout, with instrument costs passed through separately. Version 1.7 settled the fee bearer, specifies the authorisation model and makes Dwellm8 Ops a full web console as well as an app. Version 1.6 added module M19 — a no-sign-up sandbox anyone can use before creating an account, and a training and release-preview sandbox for existing customers and their staff. Version 1.5 defined the five access tiers, the no-anonymous rule for administrative surfaces, and the demonstration-data workspace. Version 1.4 settled identity and authorisation — Google Identity Platform for every user, OpenFGA plus RBAC for permissions. Version 1.3 added public discovery, listings and inspection scheduling, and settles the technology stack. Version 1.2 made the Admin surface web and mobile together. Version 1.1 replaced the subscription model with a flat 2.99% transaction fee and adds the premium AI tier, the Admin web console, the end-to-end workflows and the integration framework. This document defines</w:t>
       </w:r>
       <w:r>
         <w:t xml:space="preserve"> </w:t>

</xml_diff>